<commit_message>
W5L3: Page Content sheets (text only, students write the HTML)
Co-Authored-By: Claude Opus 5.5 <noreply@anthropic.com>
</commit_message>
<xml_diff>
--- a/planners/Week 5 Planner v2.docx
+++ b/planners/Week 5 Planner v2.docx
@@ -1390,7 +1390,7 @@
                 <w:b w:val="0"/>
                 <w:sz w:val="16"/>
               </w:rPr>
-              <w:t>F1 Website Page Builder sheet, code editor, browser</w:t>
+              <w:t>F1 Website Page Content sheet, code editor, browser</w:t>
             </w:r>
           </w:p>
         </w:tc>
@@ -2234,7 +2234,7 @@
                 <w:b w:val="0"/>
                 <w:sz w:val="16"/>
               </w:rPr>
-              <w:t>Students create about.html, contact.html and vision.html using the text on their sheet</w:t>
+              <w:t>Students create about.html, contact.html and vision.html writing the HTML for the text on their Page Content sheet</w:t>
             </w:r>
           </w:p>
         </w:tc>

</xml_diff>

<commit_message>
W5L3: students also connect the four pages with a navigation menu and hyperlinks
Co-Authored-By: Claude Opus 5.5 <noreply@anthropic.com>
</commit_message>
<xml_diff>
--- a/planners/Week 5 Planner v2.docx
+++ b/planners/Week 5 Planner v2.docx
@@ -842,7 +842,7 @@
                 <w:b w:val="0"/>
                 <w:sz w:val="16"/>
               </w:rPr>
-              <w:t>To build a website with four pages from scratch using headings, paragraphs and lists.</w:t>
+              <w:t>To build a four-page website from scratch and connect the pages with a navigation menu of hyperlinks.</w:t>
             </w:r>
           </w:p>
         </w:tc>
@@ -1042,7 +1042,7 @@
                 <w:b w:val="0"/>
                 <w:sz w:val="16"/>
               </w:rPr>
-              <w:t>- Each page shows its heading and text in the browser.</w:t>
+              <w:t>- The navigation menu is on every page and every link works.</w:t>
             </w:r>
           </w:p>
         </w:tc>
@@ -2234,7 +2234,7 @@
                 <w:b w:val="0"/>
                 <w:sz w:val="16"/>
               </w:rPr>
-              <w:t>Students create about.html, contact.html and vision.html writing the HTML for the text on their Page Content sheet</w:t>
+              <w:t>Students build about.html, contact.html and vision.html from the Page Content sheet, add the navigation menu to every page plus the formula1.com link, and test every link</w:t>
             </w:r>
           </w:p>
         </w:tc>
@@ -2699,7 +2699,7 @@
                 <w:b w:val="0"/>
                 <w:sz w:val="16"/>
               </w:rPr>
-              <w:t>Show all 4 pages open in the browser; next lesson we connect them with hyperlinks</w:t>
+              <w:t>Show a partner you can reach every page from every other page using the menu</w:t>
             </w:r>
           </w:p>
         </w:tc>

</xml_diff>

<commit_message>
W5L4: two-day task - Final Checklist, Example Code for stuck students, updated deck and plan
Co-Authored-By: Claude Opus 5.5 <noreply@anthropic.com>
</commit_message>
<xml_diff>
--- a/planners/Week 5 Planner v2.docx
+++ b/planners/Week 5 Planner v2.docx
@@ -191,7 +191,7 @@
                 <w:b w:val="0"/>
                 <w:sz w:val="16"/>
               </w:rPr>
-              <w:t>Lesson 4: Formative Assessment: Connecting the F1 Website</w:t>
+              <w:t>Lesson 4: Formative Assessment: Finishing and Checking the F1 Website</w:t>
             </w:r>
           </w:p>
         </w:tc>
@@ -874,7 +874,7 @@
                 <w:b w:val="0"/>
                 <w:sz w:val="16"/>
               </w:rPr>
-              <w:t>To connect four webpages with working hyperlinks and navigation.</w:t>
+              <w:t>To finish and check a four-page website with working hyperlinks and navigation.</w:t>
             </w:r>
           </w:p>
         </w:tc>
@@ -1422,7 +1422,7 @@
                 <w:b w:val="0"/>
                 <w:sz w:val="16"/>
               </w:rPr>
-              <w:t>F1 Website Hyperlinks Task sheet, rubric, code editor, browser, Toddle</w:t>
+              <w:t>F1 Website Final Checklist, Example Code sheet (for students who are stuck), rubric, code editor, browser, Toddle</w:t>
             </w:r>
           </w:p>
         </w:tc>
@@ -1918,7 +1918,7 @@
                 <w:b w:val="0"/>
                 <w:sz w:val="16"/>
               </w:rPr>
-              <w:t>Spot the bug in 3 broken links; model pasting the same nav menu into every page</w:t>
+              <w:t>Spot the bug in 3 broken links; explain the Final Checklist and the rubric</w:t>
             </w:r>
           </w:p>
         </w:tc>
@@ -2092,7 +2092,7 @@
                 <w:b w:val="0"/>
                 <w:sz w:val="16"/>
               </w:rPr>
-              <w:t>Explain the task and rubric; add the external formula1.com link together</w:t>
+              <w:t>Students finish their site from Lesson 3; teacher circulates and points stuck students to the Example Code sheet</w:t>
             </w:r>
           </w:p>
         </w:tc>
@@ -2266,7 +2266,7 @@
                 <w:b w:val="0"/>
                 <w:sz w:val="16"/>
               </w:rPr>
-              <w:t>Students add the menu to all 4 pages, test every link with the table, peer test, and submit via Toddle</w:t>
+              <w:t>Students complete every check on the Final Checklist, test all links, peer test, and submit via Toddle</w:t>
             </w:r>
           </w:p>
         </w:tc>
@@ -2544,7 +2544,7 @@
                 <w:b w:val="0"/>
                 <w:sz w:val="16"/>
               </w:rPr>
-              <w:t>Beginning: Support sheet with a filename tip; rubric reviewed 1:1; extra time as needed</w:t>
+              <w:t>Beginning: Support checklist with the example code on the back; rubric reviewed 1:1; extra time as needed</w:t>
             </w:r>
           </w:p>
           <w:p>
@@ -2557,7 +2557,7 @@
                 <w:b w:val="0"/>
                 <w:sz w:val="16"/>
               </w:rPr>
-              <w:t>On: Complete and test the navigation independently against the rubric</w:t>
+              <w:t>On: Finish and check the website independently against the checklist</w:t>
             </w:r>
           </w:p>
           <w:p>

</xml_diff>